<commit_message>
remaining part of obs file based on n/s of medicine names
</commit_message>
<xml_diff>
--- a/day 3 recap.docx
+++ b/day 3 recap.docx
@@ -52,6 +52,12 @@
       <w:proofErr w:type="gramEnd"/>
       <w:r>
         <w:t>keep increasing seed range)</w:t>
+      </w:r>
+      <w:r>
+        <w:t xml:space="preserve">: </w:t>
+      </w:r>
+      <w:r>
+        <w:t>python view_samples.py --n 50 --seed 600</w:t>
       </w:r>
     </w:p>
     <w:p>
@@ -876,6 +882,7 @@
   <w:style w:type="character" w:default="1" w:styleId="DefaultParagraphFont">
     <w:name w:val="Default Paragraph Font"/>
     <w:uiPriority w:val="1"/>
+    <w:semiHidden/>
     <w:unhideWhenUsed/>
   </w:style>
   <w:style w:type="table" w:default="1" w:styleId="TableNormal">

</xml_diff>